<commit_message>
data: refresh SysML AI catalog
</commit_message>
<xml_diff>
--- a/public/reports/sysml-ai-research-report.docx
+++ b/public/reports/sysml-ai-research-report.docx
@@ -88,7 +88,7 @@
                 <w:color w:val="0B2545"/>
                 <w:sz w:val="22"/>
               </w:rPr>
-              <w:t>2026-09-13</w:t>
+              <w:t>2026-09-16</w:t>
             </w:r>
           </w:p>
         </w:tc>
@@ -122,7 +122,7 @@
                 <w:color w:val="0B2545"/>
                 <w:sz w:val="22"/>
               </w:rPr>
-              <w:t>2026-09-16</w:t>
+              <w:t>2026-09-19</w:t>
             </w:r>
           </w:p>
         </w:tc>
@@ -158,7 +158,7 @@
                 <w:color w:val="0B2545"/>
                 <w:sz w:val="22"/>
               </w:rPr>
-              <w:t>34 个</w:t>
+              <w:t>35 个</w:t>
             </w:r>
           </w:p>
         </w:tc>
@@ -220,7 +220,7 @@
           <w:rFonts w:ascii="Microsoft YaHei" w:hAnsi="Microsoft YaHei" w:eastAsia="Microsoft YaHei"/>
           <w:color w:val="0B2545"/>
         </w:rPr>
-        <w:t xml:space="preserve"> 当前共收录 34 个项目，其中 5 个已验证、31 个确认为开源。 调研重点是这些工具在系统建模生命周期中的实际用途，而不只是在何种 AI 客户端中运行。</w:t>
+        <w:t xml:space="preserve"> 当前共收录 35 个项目，其中 5 个已验证、32 个确认为开源。 调研重点是这些工具在系统建模生命周期中的实际用途，而不只是在何种 AI 客户端中运行。</w:t>
       </w:r>
     </w:p>
     <w:p>
@@ -235,7 +235,7 @@
           <w:color w:val="0B2545"/>
           <w:sz w:val="22"/>
         </w:rPr>
-        <w:t>标准覆盖：SysML v2（18）；KerML（3）；通用 MBSE（1）；SysML (version unspecified)（10）；SysML v1（5）；UML（1）</w:t>
+        <w:t>标准覆盖：SysML v2（19）；KerML（3）；通用 MBSE（1）；SysML (version unspecified)（10）；SysML v1（5）；UML（1）</w:t>
       </w:r>
     </w:p>
     <w:p>
@@ -438,7 +438,7 @@
                 <w:color w:val="0B2545"/>
                 <w:sz w:val="17"/>
               </w:rPr>
-              <w:t>FocusTick、HL7-HSRA_E2-SFM2SysMLv2-Agent、INSPECTA-Spec-Code-Proof-Copilot、mappy_mini、mbse-local-ai-demo、mbseagent2、mora-pochettino、se-buddy-agent、sidkolapalli、SysML2-spec-gpt、sysmlv2-ai-toolkit、sysprose</w:t>
+              <w:t>FocusTick、HL7-HSRA_E2-SFM2SysMLv2-Agent、INSPECTA-Spec-Code-Proof-Copilot、keel、mappy_mini、mbse-local-ai-demo、mbseagent2、mora-pochettino、se-buddy-agent、sidkolapalli、SysML2-spec-gpt、sysmlv2-ai-toolkit、sysprose</w:t>
             </w:r>
           </w:p>
         </w:tc>
@@ -6457,7 +6457,380 @@
         <w:pageBreakBefore/>
       </w:pPr>
       <w:r>
-        <w:t>3.16 mappy_mini</w:t>
+        <w:t>3.16 keel</w:t>
+      </w:r>
+    </w:p>
+    <w:p>
+      <w:pPr>
+        <w:spacing w:after="160"/>
+      </w:pPr>
+      <w:r>
+        <w:rPr>
+          <w:rFonts w:ascii="Microsoft YaHei" w:hAnsi="Microsoft YaHei" w:eastAsia="Microsoft YaHei"/>
+          <w:b/>
+          <w:color w:val="007079"/>
+          <w:sz w:val="18"/>
+        </w:rPr>
+        <w:t>Agent · SysML v2 · 待验证 · 开源</w:t>
+      </w:r>
+    </w:p>
+    <w:tbl>
+      <w:tblPr>
+        <w:tblStyle w:val="TableGrid"/>
+        <w:tblW w:type="dxa" w:w="9360"/>
+        <w:jc w:val="left"/>
+        <w:tblLayout w:type="fixed"/>
+        <w:tblLook w:firstColumn="1" w:firstRow="1" w:lastColumn="0" w:lastRow="0" w:noHBand="0" w:noVBand="1" w:val="04A0"/>
+        <w:tblInd w:w="120" w:type="dxa"/>
+      </w:tblPr>
+      <w:tblGrid>
+        <w:gridCol w:w="1700"/>
+        <w:gridCol w:w="7660"/>
+      </w:tblGrid>
+      <w:tr>
+        <w:tc>
+          <w:tcPr>
+            <w:tcW w:type="dxa" w:w="1700"/>
+            <w:shd w:fill="E8EEF5"/>
+            <w:vAlign w:val="top"/>
+            <w:tcMar>
+              <w:top w:w="80" w:type="dxa"/>
+              <w:start w:w="120" w:type="dxa"/>
+              <w:bottom w:w="80" w:type="dxa"/>
+              <w:end w:w="120" w:type="dxa"/>
+            </w:tcMar>
+          </w:tcPr>
+          <w:p>
+            <w:r>
+              <w:rPr>
+                <w:rFonts w:ascii="Microsoft YaHei" w:hAnsi="Microsoft YaHei" w:eastAsia="Microsoft YaHei"/>
+                <w:b/>
+                <w:color w:val="0B2545"/>
+                <w:sz w:val="18"/>
+              </w:rPr>
+              <w:t>功能说明</w:t>
+            </w:r>
+          </w:p>
+        </w:tc>
+        <w:tc>
+          <w:tcPr>
+            <w:tcW w:type="dxa" w:w="7660"/>
+            <w:vAlign w:val="top"/>
+            <w:tcMar>
+              <w:top w:w="80" w:type="dxa"/>
+              <w:start w:w="120" w:type="dxa"/>
+              <w:bottom w:w="80" w:type="dxa"/>
+              <w:end w:w="120" w:type="dxa"/>
+            </w:tcMar>
+          </w:tcPr>
+          <w:p>
+            <w:r>
+              <w:rPr>
+                <w:rFonts w:ascii="Microsoft YaHei" w:hAnsi="Microsoft YaHei" w:eastAsia="Microsoft YaHei"/>
+                <w:color w:val="0B2545"/>
+                <w:sz w:val="18"/>
+              </w:rPr>
+              <w:t>公开描述：A sysmlv2-backed AI workflow template。该功能说明由规则提取，需在下一次人工复核时确认。</w:t>
+            </w:r>
+          </w:p>
+        </w:tc>
+      </w:tr>
+      <w:tr>
+        <w:tc>
+          <w:tcPr>
+            <w:tcW w:type="dxa" w:w="1700"/>
+            <w:shd w:fill="E8EEF5"/>
+            <w:vAlign w:val="top"/>
+            <w:tcMar>
+              <w:top w:w="80" w:type="dxa"/>
+              <w:start w:w="120" w:type="dxa"/>
+              <w:bottom w:w="80" w:type="dxa"/>
+              <w:end w:w="120" w:type="dxa"/>
+            </w:tcMar>
+          </w:tcPr>
+          <w:p>
+            <w:r>
+              <w:rPr>
+                <w:rFonts w:ascii="Microsoft YaHei" w:hAnsi="Microsoft YaHei" w:eastAsia="Microsoft YaHei"/>
+                <w:b/>
+                <w:color w:val="0B2545"/>
+                <w:sz w:val="18"/>
+              </w:rPr>
+              <w:t>适用场景</w:t>
+            </w:r>
+          </w:p>
+        </w:tc>
+        <w:tc>
+          <w:tcPr>
+            <w:tcW w:type="dxa" w:w="7660"/>
+            <w:vAlign w:val="top"/>
+            <w:tcMar>
+              <w:top w:w="80" w:type="dxa"/>
+              <w:start w:w="120" w:type="dxa"/>
+              <w:bottom w:w="80" w:type="dxa"/>
+              <w:end w:w="120" w:type="dxa"/>
+            </w:tcMar>
+          </w:tcPr>
+          <w:p>
+            <w:r>
+              <w:rPr>
+                <w:rFonts w:ascii="Microsoft YaHei" w:hAnsi="Microsoft YaHei" w:eastAsia="Microsoft YaHei"/>
+                <w:color w:val="0B2545"/>
+                <w:sz w:val="18"/>
+              </w:rPr>
+              <w:t>模型理解、模型审查</w:t>
+            </w:r>
+          </w:p>
+        </w:tc>
+      </w:tr>
+      <w:tr>
+        <w:tc>
+          <w:tcPr>
+            <w:tcW w:type="dxa" w:w="1700"/>
+            <w:shd w:fill="E8EEF5"/>
+            <w:vAlign w:val="top"/>
+            <w:tcMar>
+              <w:top w:w="80" w:type="dxa"/>
+              <w:start w:w="120" w:type="dxa"/>
+              <w:bottom w:w="80" w:type="dxa"/>
+              <w:end w:w="120" w:type="dxa"/>
+            </w:tcMar>
+          </w:tcPr>
+          <w:p>
+            <w:r>
+              <w:rPr>
+                <w:rFonts w:ascii="Microsoft YaHei" w:hAnsi="Microsoft YaHei" w:eastAsia="Microsoft YaHei"/>
+                <w:b/>
+                <w:color w:val="0B2545"/>
+                <w:sz w:val="18"/>
+              </w:rPr>
+              <w:t>核心能力</w:t>
+            </w:r>
+          </w:p>
+        </w:tc>
+        <w:tc>
+          <w:tcPr>
+            <w:tcW w:type="dxa" w:w="7660"/>
+            <w:vAlign w:val="top"/>
+            <w:tcMar>
+              <w:top w:w="80" w:type="dxa"/>
+              <w:start w:w="120" w:type="dxa"/>
+              <w:bottom w:w="80" w:type="dxa"/>
+              <w:end w:w="120" w:type="dxa"/>
+            </w:tcMar>
+          </w:tcPr>
+          <w:p>
+            <w:r>
+              <w:rPr>
+                <w:rFonts w:ascii="Microsoft YaHei" w:hAnsi="Microsoft YaHei" w:eastAsia="Microsoft YaHei"/>
+                <w:color w:val="0B2545"/>
+                <w:sz w:val="18"/>
+              </w:rPr>
+              <w:t>待进一步分析</w:t>
+            </w:r>
+          </w:p>
+        </w:tc>
+      </w:tr>
+      <w:tr>
+        <w:tc>
+          <w:tcPr>
+            <w:tcW w:type="dxa" w:w="1700"/>
+            <w:shd w:fill="E8EEF5"/>
+            <w:vAlign w:val="top"/>
+            <w:tcMar>
+              <w:top w:w="80" w:type="dxa"/>
+              <w:start w:w="120" w:type="dxa"/>
+              <w:bottom w:w="80" w:type="dxa"/>
+              <w:end w:w="120" w:type="dxa"/>
+            </w:tcMar>
+          </w:tcPr>
+          <w:p>
+            <w:r>
+              <w:rPr>
+                <w:rFonts w:ascii="Microsoft YaHei" w:hAnsi="Microsoft YaHei" w:eastAsia="Microsoft YaHei"/>
+                <w:b/>
+                <w:color w:val="0B2545"/>
+                <w:sz w:val="18"/>
+              </w:rPr>
+              <w:t>支持平台</w:t>
+            </w:r>
+          </w:p>
+        </w:tc>
+        <w:tc>
+          <w:tcPr>
+            <w:tcW w:type="dxa" w:w="7660"/>
+            <w:vAlign w:val="top"/>
+            <w:tcMar>
+              <w:top w:w="80" w:type="dxa"/>
+              <w:start w:w="120" w:type="dxa"/>
+              <w:bottom w:w="80" w:type="dxa"/>
+              <w:end w:w="120" w:type="dxa"/>
+            </w:tcMar>
+          </w:tcPr>
+          <w:p>
+            <w:r>
+              <w:rPr>
+                <w:rFonts w:ascii="Microsoft YaHei" w:hAnsi="Microsoft YaHei" w:eastAsia="Microsoft YaHei"/>
+                <w:color w:val="0B2545"/>
+                <w:sz w:val="18"/>
+              </w:rPr>
+              <w:t>To verify</w:t>
+            </w:r>
+          </w:p>
+        </w:tc>
+      </w:tr>
+      <w:tr>
+        <w:tc>
+          <w:tcPr>
+            <w:tcW w:type="dxa" w:w="1700"/>
+            <w:shd w:fill="E8EEF5"/>
+            <w:vAlign w:val="top"/>
+            <w:tcMar>
+              <w:top w:w="80" w:type="dxa"/>
+              <w:start w:w="120" w:type="dxa"/>
+              <w:bottom w:w="80" w:type="dxa"/>
+              <w:end w:w="120" w:type="dxa"/>
+            </w:tcMar>
+          </w:tcPr>
+          <w:p>
+            <w:r>
+              <w:rPr>
+                <w:rFonts w:ascii="Microsoft YaHei" w:hAnsi="Microsoft YaHei" w:eastAsia="Microsoft YaHei"/>
+                <w:b/>
+                <w:color w:val="0B2545"/>
+                <w:sz w:val="18"/>
+              </w:rPr>
+              <w:t>隐私与离线</w:t>
+            </w:r>
+          </w:p>
+        </w:tc>
+        <w:tc>
+          <w:tcPr>
+            <w:tcW w:type="dxa" w:w="7660"/>
+            <w:vAlign w:val="top"/>
+            <w:tcMar>
+              <w:top w:w="80" w:type="dxa"/>
+              <w:start w:w="120" w:type="dxa"/>
+              <w:bottom w:w="80" w:type="dxa"/>
+              <w:end w:w="120" w:type="dxa"/>
+            </w:tcMar>
+          </w:tcPr>
+          <w:p>
+            <w:r>
+              <w:rPr>
+                <w:rFonts w:ascii="Microsoft YaHei" w:hAnsi="Microsoft YaHei" w:eastAsia="Microsoft YaHei"/>
+                <w:color w:val="0B2545"/>
+                <w:sz w:val="18"/>
+              </w:rPr>
+              <w:t>自动发现项目，数据隐私与离线能力尚待核验。（离线能力：unknown）</w:t>
+            </w:r>
+          </w:p>
+        </w:tc>
+      </w:tr>
+      <w:tr>
+        <w:tc>
+          <w:tcPr>
+            <w:tcW w:type="dxa" w:w="1700"/>
+            <w:shd w:fill="E8EEF5"/>
+            <w:vAlign w:val="top"/>
+            <w:tcMar>
+              <w:top w:w="80" w:type="dxa"/>
+              <w:start w:w="120" w:type="dxa"/>
+              <w:bottom w:w="80" w:type="dxa"/>
+              <w:end w:w="120" w:type="dxa"/>
+            </w:tcMar>
+          </w:tcPr>
+          <w:p>
+            <w:r>
+              <w:rPr>
+                <w:rFonts w:ascii="Microsoft YaHei" w:hAnsi="Microsoft YaHei" w:eastAsia="Microsoft YaHei"/>
+                <w:b/>
+                <w:color w:val="0B2545"/>
+                <w:sz w:val="18"/>
+              </w:rPr>
+              <w:t>项目地址</w:t>
+            </w:r>
+          </w:p>
+        </w:tc>
+        <w:tc>
+          <w:tcPr>
+            <w:tcW w:type="dxa" w:w="7660"/>
+            <w:vAlign w:val="top"/>
+            <w:tcMar>
+              <w:top w:w="80" w:type="dxa"/>
+              <w:start w:w="120" w:type="dxa"/>
+              <w:bottom w:w="80" w:type="dxa"/>
+              <w:end w:w="120" w:type="dxa"/>
+            </w:tcMar>
+          </w:tcPr>
+          <w:p>
+            <w:r>
+              <w:rPr>
+                <w:rFonts w:ascii="Microsoft YaHei" w:hAnsi="Microsoft YaHei" w:eastAsia="Microsoft YaHei"/>
+                <w:color w:val="0B2545"/>
+                <w:sz w:val="18"/>
+              </w:rPr>
+              <w:t>https://github.com/williamweatherholtz/keel</w:t>
+            </w:r>
+          </w:p>
+        </w:tc>
+      </w:tr>
+      <w:tr>
+        <w:tc>
+          <w:tcPr>
+            <w:tcW w:type="dxa" w:w="1700"/>
+            <w:shd w:fill="E8EEF5"/>
+            <w:vAlign w:val="top"/>
+            <w:tcMar>
+              <w:top w:w="80" w:type="dxa"/>
+              <w:start w:w="120" w:type="dxa"/>
+              <w:bottom w:w="80" w:type="dxa"/>
+              <w:end w:w="120" w:type="dxa"/>
+            </w:tcMar>
+          </w:tcPr>
+          <w:p>
+            <w:r>
+              <w:rPr>
+                <w:rFonts w:ascii="Microsoft YaHei" w:hAnsi="Microsoft YaHei" w:eastAsia="Microsoft YaHei"/>
+                <w:b/>
+                <w:color w:val="0B2545"/>
+                <w:sz w:val="18"/>
+              </w:rPr>
+              <w:t>核验来源</w:t>
+            </w:r>
+          </w:p>
+        </w:tc>
+        <w:tc>
+          <w:tcPr>
+            <w:tcW w:type="dxa" w:w="7660"/>
+            <w:vAlign w:val="top"/>
+            <w:tcMar>
+              <w:top w:w="80" w:type="dxa"/>
+              <w:start w:w="120" w:type="dxa"/>
+              <w:bottom w:w="80" w:type="dxa"/>
+              <w:end w:w="120" w:type="dxa"/>
+            </w:tcMar>
+          </w:tcPr>
+          <w:p>
+            <w:r>
+              <w:rPr>
+                <w:rFonts w:ascii="Microsoft YaHei" w:hAnsi="Microsoft YaHei" w:eastAsia="Microsoft YaHei"/>
+                <w:color w:val="0B2545"/>
+                <w:sz w:val="18"/>
+              </w:rPr>
+              <w:t>https://github.com/williamweatherholtz/keel</w:t>
+            </w:r>
+          </w:p>
+        </w:tc>
+      </w:tr>
+    </w:tbl>
+    <w:p>
+      <w:pPr>
+        <w:pStyle w:val="Heading2"/>
+        <w:pageBreakBefore/>
+      </w:pPr>
+      <w:r>
+        <w:t>3.17 mappy_mini</w:t>
       </w:r>
     </w:p>
     <w:p>
@@ -6830,7 +7203,7 @@
         <w:pageBreakBefore/>
       </w:pPr>
       <w:r>
-        <w:t>3.17 mbse-local-ai-demo</w:t>
+        <w:t>3.18 mbse-local-ai-demo</w:t>
       </w:r>
     </w:p>
     <w:p>
@@ -7203,7 +7576,7 @@
         <w:pageBreakBefore/>
       </w:pPr>
       <w:r>
-        <w:t>3.18 mbseagent2</w:t>
+        <w:t>3.19 mbseagent2</w:t>
       </w:r>
     </w:p>
     <w:p>
@@ -7576,7 +7949,7 @@
         <w:pageBreakBefore/>
       </w:pPr>
       <w:r>
-        <w:t>3.19 mcp-syson</w:t>
+        <w:t>3.20 mcp-syson</w:t>
       </w:r>
     </w:p>
     <w:p>
@@ -7949,7 +8322,7 @@
         <w:pageBreakBefore/>
       </w:pPr>
       <w:r>
-        <w:t>3.20 mora-pochettino</w:t>
+        <w:t>3.21 mora-pochettino</w:t>
       </w:r>
     </w:p>
     <w:p>
@@ -8322,7 +8695,7 @@
         <w:pageBreakBefore/>
       </w:pPr>
       <w:r>
-        <w:t>3.21 mycelium-hypha</w:t>
+        <w:t>3.22 mycelium-hypha</w:t>
       </w:r>
     </w:p>
     <w:p>
@@ -8695,7 +9068,7 @@
         <w:pageBreakBefore/>
       </w:pPr>
       <w:r>
-        <w:t>3.22 se-buddy-agent</w:t>
+        <w:t>3.23 se-buddy-agent</w:t>
       </w:r>
     </w:p>
     <w:p>
@@ -9068,7 +9441,7 @@
         <w:pageBreakBefore/>
       </w:pPr>
       <w:r>
-        <w:t>3.23 sidkolapalli</w:t>
+        <w:t>3.24 sidkolapalli</w:t>
       </w:r>
     </w:p>
     <w:p>
@@ -9441,7 +9814,7 @@
         <w:pageBreakBefore/>
       </w:pPr>
       <w:r>
-        <w:t>3.24 SysML v2 MCP Server by Raghunath Torase</w:t>
+        <w:t>3.25 SysML v2 MCP Server by Raghunath Torase</w:t>
       </w:r>
     </w:p>
     <w:p>
@@ -9814,7 +10187,7 @@
         <w:pageBreakBefore/>
       </w:pPr>
       <w:r>
-        <w:t>3.25 sysml-ai-hub</w:t>
+        <w:t>3.26 sysml-ai-hub</w:t>
       </w:r>
     </w:p>
     <w:p>
@@ -10187,7 +10560,7 @@
         <w:pageBreakBefore/>
       </w:pPr>
       <w:r>
-        <w:t>3.26 sysml-rs</w:t>
+        <w:t>3.27 sysml-rs</w:t>
       </w:r>
     </w:p>
     <w:p>
@@ -10549,379 +10922,6 @@
                 <w:sz w:val="18"/>
               </w:rPr>
               <w:t>https://github.com/RickyMillar/sysml-rs</w:t>
-            </w:r>
-          </w:p>
-        </w:tc>
-      </w:tr>
-    </w:tbl>
-    <w:p>
-      <w:pPr>
-        <w:pStyle w:val="Heading2"/>
-        <w:pageBreakBefore/>
-      </w:pPr>
-      <w:r>
-        <w:t>3.27 sysml-v2-lsp</w:t>
-      </w:r>
-    </w:p>
-    <w:p>
-      <w:pPr>
-        <w:spacing w:after="160"/>
-      </w:pPr>
-      <w:r>
-        <w:rPr>
-          <w:rFonts w:ascii="Microsoft YaHei" w:hAnsi="Microsoft YaHei" w:eastAsia="Microsoft YaHei"/>
-          <w:b/>
-          <w:color w:val="007079"/>
-          <w:sz w:val="18"/>
-        </w:rPr>
-        <w:t>MCP Server · SysML v2 · 待验证 · 开源</w:t>
-      </w:r>
-    </w:p>
-    <w:tbl>
-      <w:tblPr>
-        <w:tblStyle w:val="TableGrid"/>
-        <w:tblW w:type="dxa" w:w="9360"/>
-        <w:jc w:val="left"/>
-        <w:tblLayout w:type="fixed"/>
-        <w:tblLook w:firstColumn="1" w:firstRow="1" w:lastColumn="0" w:lastRow="0" w:noHBand="0" w:noVBand="1" w:val="04A0"/>
-        <w:tblInd w:w="120" w:type="dxa"/>
-      </w:tblPr>
-      <w:tblGrid>
-        <w:gridCol w:w="1700"/>
-        <w:gridCol w:w="7660"/>
-      </w:tblGrid>
-      <w:tr>
-        <w:tc>
-          <w:tcPr>
-            <w:tcW w:type="dxa" w:w="1700"/>
-            <w:shd w:fill="E8EEF5"/>
-            <w:vAlign w:val="top"/>
-            <w:tcMar>
-              <w:top w:w="80" w:type="dxa"/>
-              <w:start w:w="120" w:type="dxa"/>
-              <w:bottom w:w="80" w:type="dxa"/>
-              <w:end w:w="120" w:type="dxa"/>
-            </w:tcMar>
-          </w:tcPr>
-          <w:p>
-            <w:r>
-              <w:rPr>
-                <w:rFonts w:ascii="Microsoft YaHei" w:hAnsi="Microsoft YaHei" w:eastAsia="Microsoft YaHei"/>
-                <w:b/>
-                <w:color w:val="0B2545"/>
-                <w:sz w:val="18"/>
-              </w:rPr>
-              <w:t>功能说明</w:t>
-            </w:r>
-          </w:p>
-        </w:tc>
-        <w:tc>
-          <w:tcPr>
-            <w:tcW w:type="dxa" w:w="7660"/>
-            <w:vAlign w:val="top"/>
-            <w:tcMar>
-              <w:top w:w="80" w:type="dxa"/>
-              <w:start w:w="120" w:type="dxa"/>
-              <w:bottom w:w="80" w:type="dxa"/>
-              <w:end w:w="120" w:type="dxa"/>
-            </w:tcMar>
-          </w:tcPr>
-          <w:p>
-            <w:r>
-              <w:rPr>
-                <w:rFonts w:ascii="Microsoft YaHei" w:hAnsi="Microsoft YaHei" w:eastAsia="Microsoft YaHei"/>
-                <w:color w:val="0B2545"/>
-                <w:sz w:val="18"/>
-              </w:rPr>
-              <w:t>公开描述：SysML v2 LSP/MCP server (forked from daltskin/sysml-v2-lsp)。该功能说明由规则提取，需在下一次人工复核时确认。</w:t>
-            </w:r>
-          </w:p>
-        </w:tc>
-      </w:tr>
-      <w:tr>
-        <w:tc>
-          <w:tcPr>
-            <w:tcW w:type="dxa" w:w="1700"/>
-            <w:shd w:fill="E8EEF5"/>
-            <w:vAlign w:val="top"/>
-            <w:tcMar>
-              <w:top w:w="80" w:type="dxa"/>
-              <w:start w:w="120" w:type="dxa"/>
-              <w:bottom w:w="80" w:type="dxa"/>
-              <w:end w:w="120" w:type="dxa"/>
-            </w:tcMar>
-          </w:tcPr>
-          <w:p>
-            <w:r>
-              <w:rPr>
-                <w:rFonts w:ascii="Microsoft YaHei" w:hAnsi="Microsoft YaHei" w:eastAsia="Microsoft YaHei"/>
-                <w:b/>
-                <w:color w:val="0B2545"/>
-                <w:sz w:val="18"/>
-              </w:rPr>
-              <w:t>适用场景</w:t>
-            </w:r>
-          </w:p>
-        </w:tc>
-        <w:tc>
-          <w:tcPr>
-            <w:tcW w:type="dxa" w:w="7660"/>
-            <w:vAlign w:val="top"/>
-            <w:tcMar>
-              <w:top w:w="80" w:type="dxa"/>
-              <w:start w:w="120" w:type="dxa"/>
-              <w:bottom w:w="80" w:type="dxa"/>
-              <w:end w:w="120" w:type="dxa"/>
-            </w:tcMar>
-          </w:tcPr>
-          <w:p>
-            <w:r>
-              <w:rPr>
-                <w:rFonts w:ascii="Microsoft YaHei" w:hAnsi="Microsoft YaHei" w:eastAsia="Microsoft YaHei"/>
-                <w:color w:val="0B2545"/>
-                <w:sz w:val="18"/>
-              </w:rPr>
-              <w:t>模型理解、模型审查</w:t>
-            </w:r>
-          </w:p>
-        </w:tc>
-      </w:tr>
-      <w:tr>
-        <w:tc>
-          <w:tcPr>
-            <w:tcW w:type="dxa" w:w="1700"/>
-            <w:shd w:fill="E8EEF5"/>
-            <w:vAlign w:val="top"/>
-            <w:tcMar>
-              <w:top w:w="80" w:type="dxa"/>
-              <w:start w:w="120" w:type="dxa"/>
-              <w:bottom w:w="80" w:type="dxa"/>
-              <w:end w:w="120" w:type="dxa"/>
-            </w:tcMar>
-          </w:tcPr>
-          <w:p>
-            <w:r>
-              <w:rPr>
-                <w:rFonts w:ascii="Microsoft YaHei" w:hAnsi="Microsoft YaHei" w:eastAsia="Microsoft YaHei"/>
-                <w:b/>
-                <w:color w:val="0B2545"/>
-                <w:sz w:val="18"/>
-              </w:rPr>
-              <w:t>核心能力</w:t>
-            </w:r>
-          </w:p>
-        </w:tc>
-        <w:tc>
-          <w:tcPr>
-            <w:tcW w:type="dxa" w:w="7660"/>
-            <w:vAlign w:val="top"/>
-            <w:tcMar>
-              <w:top w:w="80" w:type="dxa"/>
-              <w:start w:w="120" w:type="dxa"/>
-              <w:bottom w:w="80" w:type="dxa"/>
-              <w:end w:w="120" w:type="dxa"/>
-            </w:tcMar>
-          </w:tcPr>
-          <w:p>
-            <w:r>
-              <w:rPr>
-                <w:rFonts w:ascii="Microsoft YaHei" w:hAnsi="Microsoft YaHei" w:eastAsia="Microsoft YaHei"/>
-                <w:color w:val="0B2545"/>
-                <w:sz w:val="18"/>
-              </w:rPr>
-              <w:t>待进一步分析</w:t>
-            </w:r>
-          </w:p>
-        </w:tc>
-      </w:tr>
-      <w:tr>
-        <w:tc>
-          <w:tcPr>
-            <w:tcW w:type="dxa" w:w="1700"/>
-            <w:shd w:fill="E8EEF5"/>
-            <w:vAlign w:val="top"/>
-            <w:tcMar>
-              <w:top w:w="80" w:type="dxa"/>
-              <w:start w:w="120" w:type="dxa"/>
-              <w:bottom w:w="80" w:type="dxa"/>
-              <w:end w:w="120" w:type="dxa"/>
-            </w:tcMar>
-          </w:tcPr>
-          <w:p>
-            <w:r>
-              <w:rPr>
-                <w:rFonts w:ascii="Microsoft YaHei" w:hAnsi="Microsoft YaHei" w:eastAsia="Microsoft YaHei"/>
-                <w:b/>
-                <w:color w:val="0B2545"/>
-                <w:sz w:val="18"/>
-              </w:rPr>
-              <w:t>支持平台</w:t>
-            </w:r>
-          </w:p>
-        </w:tc>
-        <w:tc>
-          <w:tcPr>
-            <w:tcW w:type="dxa" w:w="7660"/>
-            <w:vAlign w:val="top"/>
-            <w:tcMar>
-              <w:top w:w="80" w:type="dxa"/>
-              <w:start w:w="120" w:type="dxa"/>
-              <w:bottom w:w="80" w:type="dxa"/>
-              <w:end w:w="120" w:type="dxa"/>
-            </w:tcMar>
-          </w:tcPr>
-          <w:p>
-            <w:r>
-              <w:rPr>
-                <w:rFonts w:ascii="Microsoft YaHei" w:hAnsi="Microsoft YaHei" w:eastAsia="Microsoft YaHei"/>
-                <w:color w:val="0B2545"/>
-                <w:sz w:val="18"/>
-              </w:rPr>
-              <w:t>MCP</w:t>
-            </w:r>
-          </w:p>
-        </w:tc>
-      </w:tr>
-      <w:tr>
-        <w:tc>
-          <w:tcPr>
-            <w:tcW w:type="dxa" w:w="1700"/>
-            <w:shd w:fill="E8EEF5"/>
-            <w:vAlign w:val="top"/>
-            <w:tcMar>
-              <w:top w:w="80" w:type="dxa"/>
-              <w:start w:w="120" w:type="dxa"/>
-              <w:bottom w:w="80" w:type="dxa"/>
-              <w:end w:w="120" w:type="dxa"/>
-            </w:tcMar>
-          </w:tcPr>
-          <w:p>
-            <w:r>
-              <w:rPr>
-                <w:rFonts w:ascii="Microsoft YaHei" w:hAnsi="Microsoft YaHei" w:eastAsia="Microsoft YaHei"/>
-                <w:b/>
-                <w:color w:val="0B2545"/>
-                <w:sz w:val="18"/>
-              </w:rPr>
-              <w:t>隐私与离线</w:t>
-            </w:r>
-          </w:p>
-        </w:tc>
-        <w:tc>
-          <w:tcPr>
-            <w:tcW w:type="dxa" w:w="7660"/>
-            <w:vAlign w:val="top"/>
-            <w:tcMar>
-              <w:top w:w="80" w:type="dxa"/>
-              <w:start w:w="120" w:type="dxa"/>
-              <w:bottom w:w="80" w:type="dxa"/>
-              <w:end w:w="120" w:type="dxa"/>
-            </w:tcMar>
-          </w:tcPr>
-          <w:p>
-            <w:r>
-              <w:rPr>
-                <w:rFonts w:ascii="Microsoft YaHei" w:hAnsi="Microsoft YaHei" w:eastAsia="Microsoft YaHei"/>
-                <w:color w:val="0B2545"/>
-                <w:sz w:val="18"/>
-              </w:rPr>
-              <w:t>自动发现项目，数据隐私与离线能力尚待核验。（离线能力：unknown）</w:t>
-            </w:r>
-          </w:p>
-        </w:tc>
-      </w:tr>
-      <w:tr>
-        <w:tc>
-          <w:tcPr>
-            <w:tcW w:type="dxa" w:w="1700"/>
-            <w:shd w:fill="E8EEF5"/>
-            <w:vAlign w:val="top"/>
-            <w:tcMar>
-              <w:top w:w="80" w:type="dxa"/>
-              <w:start w:w="120" w:type="dxa"/>
-              <w:bottom w:w="80" w:type="dxa"/>
-              <w:end w:w="120" w:type="dxa"/>
-            </w:tcMar>
-          </w:tcPr>
-          <w:p>
-            <w:r>
-              <w:rPr>
-                <w:rFonts w:ascii="Microsoft YaHei" w:hAnsi="Microsoft YaHei" w:eastAsia="Microsoft YaHei"/>
-                <w:b/>
-                <w:color w:val="0B2545"/>
-                <w:sz w:val="18"/>
-              </w:rPr>
-              <w:t>项目地址</w:t>
-            </w:r>
-          </w:p>
-        </w:tc>
-        <w:tc>
-          <w:tcPr>
-            <w:tcW w:type="dxa" w:w="7660"/>
-            <w:vAlign w:val="top"/>
-            <w:tcMar>
-              <w:top w:w="80" w:type="dxa"/>
-              <w:start w:w="120" w:type="dxa"/>
-              <w:bottom w:w="80" w:type="dxa"/>
-              <w:end w:w="120" w:type="dxa"/>
-            </w:tcMar>
-          </w:tcPr>
-          <w:p>
-            <w:r>
-              <w:rPr>
-                <w:rFonts w:ascii="Microsoft YaHei" w:hAnsi="Microsoft YaHei" w:eastAsia="Microsoft YaHei"/>
-                <w:color w:val="0B2545"/>
-                <w:sz w:val="18"/>
-              </w:rPr>
-              <w:t>https://github.com/debaditya-mohankudo/sysml-v2-lsp</w:t>
-            </w:r>
-          </w:p>
-        </w:tc>
-      </w:tr>
-      <w:tr>
-        <w:tc>
-          <w:tcPr>
-            <w:tcW w:type="dxa" w:w="1700"/>
-            <w:shd w:fill="E8EEF5"/>
-            <w:vAlign w:val="top"/>
-            <w:tcMar>
-              <w:top w:w="80" w:type="dxa"/>
-              <w:start w:w="120" w:type="dxa"/>
-              <w:bottom w:w="80" w:type="dxa"/>
-              <w:end w:w="120" w:type="dxa"/>
-            </w:tcMar>
-          </w:tcPr>
-          <w:p>
-            <w:r>
-              <w:rPr>
-                <w:rFonts w:ascii="Microsoft YaHei" w:hAnsi="Microsoft YaHei" w:eastAsia="Microsoft YaHei"/>
-                <w:b/>
-                <w:color w:val="0B2545"/>
-                <w:sz w:val="18"/>
-              </w:rPr>
-              <w:t>核验来源</w:t>
-            </w:r>
-          </w:p>
-        </w:tc>
-        <w:tc>
-          <w:tcPr>
-            <w:tcW w:type="dxa" w:w="7660"/>
-            <w:vAlign w:val="top"/>
-            <w:tcMar>
-              <w:top w:w="80" w:type="dxa"/>
-              <w:start w:w="120" w:type="dxa"/>
-              <w:bottom w:w="80" w:type="dxa"/>
-              <w:end w:w="120" w:type="dxa"/>
-            </w:tcMar>
-          </w:tcPr>
-          <w:p>
-            <w:r>
-              <w:rPr>
-                <w:rFonts w:ascii="Microsoft YaHei" w:hAnsi="Microsoft YaHei" w:eastAsia="Microsoft YaHei"/>
-                <w:color w:val="0B2545"/>
-                <w:sz w:val="18"/>
-              </w:rPr>
-              <w:t>https://github.com/debaditya-mohankudo/sysml-v2-lsp</w:t>
             </w:r>
           </w:p>
         </w:tc>
@@ -11006,7 +11006,7 @@
                 <w:color w:val="0B2545"/>
                 <w:sz w:val="18"/>
               </w:rPr>
-              <w:t>公开描述：SysML v2 Language Server Protocol implementation for VS Code, powered by ANTLR4. Includes MCP server for AI tool integration.。该功能说明由规则提取，需在下一次人工复核时确认。</w:t>
+              <w:t>公开描述：SysML v2 LSP/MCP server (forked from daltskin/sysml-v2-lsp)。该功能说明由规则提取，需在下一次人工复核时确认。</w:t>
             </w:r>
           </w:p>
         </w:tc>
@@ -11246,7 +11246,7 @@
                 <w:color w:val="0B2545"/>
                 <w:sz w:val="18"/>
               </w:rPr>
-              <w:t>https://github.com/daltskin/sysml-v2-lsp</w:t>
+              <w:t>https://github.com/debaditya-mohankudo/sysml-v2-lsp</w:t>
             </w:r>
           </w:p>
         </w:tc>
@@ -11294,7 +11294,7 @@
                 <w:color w:val="0B2545"/>
                 <w:sz w:val="18"/>
               </w:rPr>
-              <w:t>https://github.com/daltskin/sysml-v2-lsp</w:t>
+              <w:t>https://github.com/debaditya-mohankudo/sysml-v2-lsp</w:t>
             </w:r>
           </w:p>
         </w:tc>
@@ -11306,7 +11306,380 @@
         <w:pageBreakBefore/>
       </w:pPr>
       <w:r>
-        <w:t>3.29 sysml-v2-modeling-skill</w:t>
+        <w:t>3.29 sysml-v2-lsp</w:t>
+      </w:r>
+    </w:p>
+    <w:p>
+      <w:pPr>
+        <w:spacing w:after="160"/>
+      </w:pPr>
+      <w:r>
+        <w:rPr>
+          <w:rFonts w:ascii="Microsoft YaHei" w:hAnsi="Microsoft YaHei" w:eastAsia="Microsoft YaHei"/>
+          <w:b/>
+          <w:color w:val="007079"/>
+          <w:sz w:val="18"/>
+        </w:rPr>
+        <w:t>MCP Server · SysML v2 · 待验证 · 开源</w:t>
+      </w:r>
+    </w:p>
+    <w:tbl>
+      <w:tblPr>
+        <w:tblStyle w:val="TableGrid"/>
+        <w:tblW w:type="dxa" w:w="9360"/>
+        <w:jc w:val="left"/>
+        <w:tblLayout w:type="fixed"/>
+        <w:tblLook w:firstColumn="1" w:firstRow="1" w:lastColumn="0" w:lastRow="0" w:noHBand="0" w:noVBand="1" w:val="04A0"/>
+        <w:tblInd w:w="120" w:type="dxa"/>
+      </w:tblPr>
+      <w:tblGrid>
+        <w:gridCol w:w="1700"/>
+        <w:gridCol w:w="7660"/>
+      </w:tblGrid>
+      <w:tr>
+        <w:tc>
+          <w:tcPr>
+            <w:tcW w:type="dxa" w:w="1700"/>
+            <w:shd w:fill="E8EEF5"/>
+            <w:vAlign w:val="top"/>
+            <w:tcMar>
+              <w:top w:w="80" w:type="dxa"/>
+              <w:start w:w="120" w:type="dxa"/>
+              <w:bottom w:w="80" w:type="dxa"/>
+              <w:end w:w="120" w:type="dxa"/>
+            </w:tcMar>
+          </w:tcPr>
+          <w:p>
+            <w:r>
+              <w:rPr>
+                <w:rFonts w:ascii="Microsoft YaHei" w:hAnsi="Microsoft YaHei" w:eastAsia="Microsoft YaHei"/>
+                <w:b/>
+                <w:color w:val="0B2545"/>
+                <w:sz w:val="18"/>
+              </w:rPr>
+              <w:t>功能说明</w:t>
+            </w:r>
+          </w:p>
+        </w:tc>
+        <w:tc>
+          <w:tcPr>
+            <w:tcW w:type="dxa" w:w="7660"/>
+            <w:vAlign w:val="top"/>
+            <w:tcMar>
+              <w:top w:w="80" w:type="dxa"/>
+              <w:start w:w="120" w:type="dxa"/>
+              <w:bottom w:w="80" w:type="dxa"/>
+              <w:end w:w="120" w:type="dxa"/>
+            </w:tcMar>
+          </w:tcPr>
+          <w:p>
+            <w:r>
+              <w:rPr>
+                <w:rFonts w:ascii="Microsoft YaHei" w:hAnsi="Microsoft YaHei" w:eastAsia="Microsoft YaHei"/>
+                <w:color w:val="0B2545"/>
+                <w:sz w:val="18"/>
+              </w:rPr>
+              <w:t>公开描述：SysML v2 Language Server Protocol implementation for VS Code, powered by ANTLR4. Includes MCP server for AI tool integration.。该功能说明由规则提取，需在下一次人工复核时确认。</w:t>
+            </w:r>
+          </w:p>
+        </w:tc>
+      </w:tr>
+      <w:tr>
+        <w:tc>
+          <w:tcPr>
+            <w:tcW w:type="dxa" w:w="1700"/>
+            <w:shd w:fill="E8EEF5"/>
+            <w:vAlign w:val="top"/>
+            <w:tcMar>
+              <w:top w:w="80" w:type="dxa"/>
+              <w:start w:w="120" w:type="dxa"/>
+              <w:bottom w:w="80" w:type="dxa"/>
+              <w:end w:w="120" w:type="dxa"/>
+            </w:tcMar>
+          </w:tcPr>
+          <w:p>
+            <w:r>
+              <w:rPr>
+                <w:rFonts w:ascii="Microsoft YaHei" w:hAnsi="Microsoft YaHei" w:eastAsia="Microsoft YaHei"/>
+                <w:b/>
+                <w:color w:val="0B2545"/>
+                <w:sz w:val="18"/>
+              </w:rPr>
+              <w:t>适用场景</w:t>
+            </w:r>
+          </w:p>
+        </w:tc>
+        <w:tc>
+          <w:tcPr>
+            <w:tcW w:type="dxa" w:w="7660"/>
+            <w:vAlign w:val="top"/>
+            <w:tcMar>
+              <w:top w:w="80" w:type="dxa"/>
+              <w:start w:w="120" w:type="dxa"/>
+              <w:bottom w:w="80" w:type="dxa"/>
+              <w:end w:w="120" w:type="dxa"/>
+            </w:tcMar>
+          </w:tcPr>
+          <w:p>
+            <w:r>
+              <w:rPr>
+                <w:rFonts w:ascii="Microsoft YaHei" w:hAnsi="Microsoft YaHei" w:eastAsia="Microsoft YaHei"/>
+                <w:color w:val="0B2545"/>
+                <w:sz w:val="18"/>
+              </w:rPr>
+              <w:t>模型理解、模型审查</w:t>
+            </w:r>
+          </w:p>
+        </w:tc>
+      </w:tr>
+      <w:tr>
+        <w:tc>
+          <w:tcPr>
+            <w:tcW w:type="dxa" w:w="1700"/>
+            <w:shd w:fill="E8EEF5"/>
+            <w:vAlign w:val="top"/>
+            <w:tcMar>
+              <w:top w:w="80" w:type="dxa"/>
+              <w:start w:w="120" w:type="dxa"/>
+              <w:bottom w:w="80" w:type="dxa"/>
+              <w:end w:w="120" w:type="dxa"/>
+            </w:tcMar>
+          </w:tcPr>
+          <w:p>
+            <w:r>
+              <w:rPr>
+                <w:rFonts w:ascii="Microsoft YaHei" w:hAnsi="Microsoft YaHei" w:eastAsia="Microsoft YaHei"/>
+                <w:b/>
+                <w:color w:val="0B2545"/>
+                <w:sz w:val="18"/>
+              </w:rPr>
+              <w:t>核心能力</w:t>
+            </w:r>
+          </w:p>
+        </w:tc>
+        <w:tc>
+          <w:tcPr>
+            <w:tcW w:type="dxa" w:w="7660"/>
+            <w:vAlign w:val="top"/>
+            <w:tcMar>
+              <w:top w:w="80" w:type="dxa"/>
+              <w:start w:w="120" w:type="dxa"/>
+              <w:bottom w:w="80" w:type="dxa"/>
+              <w:end w:w="120" w:type="dxa"/>
+            </w:tcMar>
+          </w:tcPr>
+          <w:p>
+            <w:r>
+              <w:rPr>
+                <w:rFonts w:ascii="Microsoft YaHei" w:hAnsi="Microsoft YaHei" w:eastAsia="Microsoft YaHei"/>
+                <w:color w:val="0B2545"/>
+                <w:sz w:val="18"/>
+              </w:rPr>
+              <w:t>待进一步分析</w:t>
+            </w:r>
+          </w:p>
+        </w:tc>
+      </w:tr>
+      <w:tr>
+        <w:tc>
+          <w:tcPr>
+            <w:tcW w:type="dxa" w:w="1700"/>
+            <w:shd w:fill="E8EEF5"/>
+            <w:vAlign w:val="top"/>
+            <w:tcMar>
+              <w:top w:w="80" w:type="dxa"/>
+              <w:start w:w="120" w:type="dxa"/>
+              <w:bottom w:w="80" w:type="dxa"/>
+              <w:end w:w="120" w:type="dxa"/>
+            </w:tcMar>
+          </w:tcPr>
+          <w:p>
+            <w:r>
+              <w:rPr>
+                <w:rFonts w:ascii="Microsoft YaHei" w:hAnsi="Microsoft YaHei" w:eastAsia="Microsoft YaHei"/>
+                <w:b/>
+                <w:color w:val="0B2545"/>
+                <w:sz w:val="18"/>
+              </w:rPr>
+              <w:t>支持平台</w:t>
+            </w:r>
+          </w:p>
+        </w:tc>
+        <w:tc>
+          <w:tcPr>
+            <w:tcW w:type="dxa" w:w="7660"/>
+            <w:vAlign w:val="top"/>
+            <w:tcMar>
+              <w:top w:w="80" w:type="dxa"/>
+              <w:start w:w="120" w:type="dxa"/>
+              <w:bottom w:w="80" w:type="dxa"/>
+              <w:end w:w="120" w:type="dxa"/>
+            </w:tcMar>
+          </w:tcPr>
+          <w:p>
+            <w:r>
+              <w:rPr>
+                <w:rFonts w:ascii="Microsoft YaHei" w:hAnsi="Microsoft YaHei" w:eastAsia="Microsoft YaHei"/>
+                <w:color w:val="0B2545"/>
+                <w:sz w:val="18"/>
+              </w:rPr>
+              <w:t>MCP</w:t>
+            </w:r>
+          </w:p>
+        </w:tc>
+      </w:tr>
+      <w:tr>
+        <w:tc>
+          <w:tcPr>
+            <w:tcW w:type="dxa" w:w="1700"/>
+            <w:shd w:fill="E8EEF5"/>
+            <w:vAlign w:val="top"/>
+            <w:tcMar>
+              <w:top w:w="80" w:type="dxa"/>
+              <w:start w:w="120" w:type="dxa"/>
+              <w:bottom w:w="80" w:type="dxa"/>
+              <w:end w:w="120" w:type="dxa"/>
+            </w:tcMar>
+          </w:tcPr>
+          <w:p>
+            <w:r>
+              <w:rPr>
+                <w:rFonts w:ascii="Microsoft YaHei" w:hAnsi="Microsoft YaHei" w:eastAsia="Microsoft YaHei"/>
+                <w:b/>
+                <w:color w:val="0B2545"/>
+                <w:sz w:val="18"/>
+              </w:rPr>
+              <w:t>隐私与离线</w:t>
+            </w:r>
+          </w:p>
+        </w:tc>
+        <w:tc>
+          <w:tcPr>
+            <w:tcW w:type="dxa" w:w="7660"/>
+            <w:vAlign w:val="top"/>
+            <w:tcMar>
+              <w:top w:w="80" w:type="dxa"/>
+              <w:start w:w="120" w:type="dxa"/>
+              <w:bottom w:w="80" w:type="dxa"/>
+              <w:end w:w="120" w:type="dxa"/>
+            </w:tcMar>
+          </w:tcPr>
+          <w:p>
+            <w:r>
+              <w:rPr>
+                <w:rFonts w:ascii="Microsoft YaHei" w:hAnsi="Microsoft YaHei" w:eastAsia="Microsoft YaHei"/>
+                <w:color w:val="0B2545"/>
+                <w:sz w:val="18"/>
+              </w:rPr>
+              <w:t>自动发现项目，数据隐私与离线能力尚待核验。（离线能力：unknown）</w:t>
+            </w:r>
+          </w:p>
+        </w:tc>
+      </w:tr>
+      <w:tr>
+        <w:tc>
+          <w:tcPr>
+            <w:tcW w:type="dxa" w:w="1700"/>
+            <w:shd w:fill="E8EEF5"/>
+            <w:vAlign w:val="top"/>
+            <w:tcMar>
+              <w:top w:w="80" w:type="dxa"/>
+              <w:start w:w="120" w:type="dxa"/>
+              <w:bottom w:w="80" w:type="dxa"/>
+              <w:end w:w="120" w:type="dxa"/>
+            </w:tcMar>
+          </w:tcPr>
+          <w:p>
+            <w:r>
+              <w:rPr>
+                <w:rFonts w:ascii="Microsoft YaHei" w:hAnsi="Microsoft YaHei" w:eastAsia="Microsoft YaHei"/>
+                <w:b/>
+                <w:color w:val="0B2545"/>
+                <w:sz w:val="18"/>
+              </w:rPr>
+              <w:t>项目地址</w:t>
+            </w:r>
+          </w:p>
+        </w:tc>
+        <w:tc>
+          <w:tcPr>
+            <w:tcW w:type="dxa" w:w="7660"/>
+            <w:vAlign w:val="top"/>
+            <w:tcMar>
+              <w:top w:w="80" w:type="dxa"/>
+              <w:start w:w="120" w:type="dxa"/>
+              <w:bottom w:w="80" w:type="dxa"/>
+              <w:end w:w="120" w:type="dxa"/>
+            </w:tcMar>
+          </w:tcPr>
+          <w:p>
+            <w:r>
+              <w:rPr>
+                <w:rFonts w:ascii="Microsoft YaHei" w:hAnsi="Microsoft YaHei" w:eastAsia="Microsoft YaHei"/>
+                <w:color w:val="0B2545"/>
+                <w:sz w:val="18"/>
+              </w:rPr>
+              <w:t>https://github.com/daltskin/sysml-v2-lsp</w:t>
+            </w:r>
+          </w:p>
+        </w:tc>
+      </w:tr>
+      <w:tr>
+        <w:tc>
+          <w:tcPr>
+            <w:tcW w:type="dxa" w:w="1700"/>
+            <w:shd w:fill="E8EEF5"/>
+            <w:vAlign w:val="top"/>
+            <w:tcMar>
+              <w:top w:w="80" w:type="dxa"/>
+              <w:start w:w="120" w:type="dxa"/>
+              <w:bottom w:w="80" w:type="dxa"/>
+              <w:end w:w="120" w:type="dxa"/>
+            </w:tcMar>
+          </w:tcPr>
+          <w:p>
+            <w:r>
+              <w:rPr>
+                <w:rFonts w:ascii="Microsoft YaHei" w:hAnsi="Microsoft YaHei" w:eastAsia="Microsoft YaHei"/>
+                <w:b/>
+                <w:color w:val="0B2545"/>
+                <w:sz w:val="18"/>
+              </w:rPr>
+              <w:t>核验来源</w:t>
+            </w:r>
+          </w:p>
+        </w:tc>
+        <w:tc>
+          <w:tcPr>
+            <w:tcW w:type="dxa" w:w="7660"/>
+            <w:vAlign w:val="top"/>
+            <w:tcMar>
+              <w:top w:w="80" w:type="dxa"/>
+              <w:start w:w="120" w:type="dxa"/>
+              <w:bottom w:w="80" w:type="dxa"/>
+              <w:end w:w="120" w:type="dxa"/>
+            </w:tcMar>
+          </w:tcPr>
+          <w:p>
+            <w:r>
+              <w:rPr>
+                <w:rFonts w:ascii="Microsoft YaHei" w:hAnsi="Microsoft YaHei" w:eastAsia="Microsoft YaHei"/>
+                <w:color w:val="0B2545"/>
+                <w:sz w:val="18"/>
+              </w:rPr>
+              <w:t>https://github.com/daltskin/sysml-v2-lsp</w:t>
+            </w:r>
+          </w:p>
+        </w:tc>
+      </w:tr>
+    </w:tbl>
+    <w:p>
+      <w:pPr>
+        <w:pStyle w:val="Heading2"/>
+        <w:pageBreakBefore/>
+      </w:pPr>
+      <w:r>
+        <w:t>3.30 sysml-v2-modeling-skill</w:t>
       </w:r>
     </w:p>
     <w:p>
@@ -11679,7 +12052,7 @@
         <w:pageBreakBefore/>
       </w:pPr>
       <w:r>
-        <w:t>3.30 SysML2-spec-gpt</w:t>
+        <w:t>3.31 SysML2-spec-gpt</w:t>
       </w:r>
     </w:p>
     <w:p>
@@ -12052,7 +12425,7 @@
         <w:pageBreakBefore/>
       </w:pPr>
       <w:r>
-        <w:t>3.31 SysMLEdge</w:t>
+        <w:t>3.32 SysMLEdge</w:t>
       </w:r>
     </w:p>
     <w:p>
@@ -12425,7 +12798,7 @@
         <w:pageBreakBefore/>
       </w:pPr>
       <w:r>
-        <w:t>3.32 sysmlv2-ai-toolkit</w:t>
+        <w:t>3.33 sysmlv2-ai-toolkit</w:t>
       </w:r>
     </w:p>
     <w:p>
@@ -12798,7 +13171,7 @@
         <w:pageBreakBefore/>
       </w:pPr>
       <w:r>
-        <w:t>3.33 sysprose</w:t>
+        <w:t>3.34 sysprose</w:t>
       </w:r>
     </w:p>
     <w:p>
@@ -13171,7 +13544,7 @@
         <w:pageBreakBefore/>
       </w:pPr>
       <w:r>
-        <w:t>3.34 verifying_SysML_v2_agentic_rag</w:t>
+        <w:t>3.35 verifying_SysML_v2_agentic_rag</w:t>
       </w:r>
     </w:p>
     <w:p>
@@ -13601,7 +13974,7 @@
           <w:color w:val="5D6B7A"/>
           <w:sz w:val="18"/>
         </w:rPr>
-        <w:t>生成时间：2026-09-15 07:44（Asia/Shanghai）</w:t>
+        <w:t>生成时间：2026-09-16 07:41（Asia/Shanghai）</w:t>
       </w:r>
     </w:p>
     <w:sectPr>

</xml_diff>